<commit_message>
Scrub all per-order identifiable details for public release
</commit_message>
<xml_diff>
--- a/package/Planner_View.docx
+++ b/package/Planner_View.docx
@@ -89,402 +89,15 @@
           <w:bCs/>
           <w:color w:val="1F4E79"/>
         </w:rPr>
-        <w:t xml:space="preserve">A few examples</w:t>
-      </w:r>
-    </w:p>
-    <w:tbl>
-      <w:tblPr>
-        <w:tblW w:type="dxa" w:w="8800"/>
-        <w:tblBorders>
-          <w:top w:val="single" w:color="auto" w:sz="4"/>
-          <w:left w:val="single" w:color="auto" w:sz="4"/>
-          <w:bottom w:val="single" w:color="auto" w:sz="4"/>
-          <w:right w:val="single" w:color="auto" w:sz="4"/>
-          <w:insideH w:val="single" w:color="auto" w:sz="4"/>
-          <w:insideV w:val="single" w:color="auto" w:sz="4"/>
-        </w:tblBorders>
-      </w:tblPr>
-      <w:tblGrid>
-        <w:gridCol w:w="2200"/>
-        <w:gridCol w:w="2200"/>
-        <w:gridCol w:w="2200"/>
-        <w:gridCol w:w="2200"/>
-      </w:tblGrid>
-      <w:tr>
-        <w:tc>
-          <w:tcPr>
-            <w:tcW w:type="dxa" w:w="2200"/>
-            <w:shd w:fill="D9E2F3" w:val="clear"/>
-          </w:tcPr>
-          <w:p>
-            <w:r>
-              <w:rPr>
-                <w:b/>
-                <w:bCs/>
-                <w:sz w:val="18"/>
-                <w:szCs w:val="18"/>
-              </w:rPr>
-              <w:t xml:space="preserve">Order</w:t>
-            </w:r>
-          </w:p>
-        </w:tc>
-        <w:tc>
-          <w:tcPr>
-            <w:tcW w:type="dxa" w:w="2200"/>
-            <w:shd w:fill="D9E2F3" w:val="clear"/>
-          </w:tcPr>
-          <w:p>
-            <w:r>
-              <w:rPr>
-                <w:b/>
-                <w:bCs/>
-                <w:sz w:val="18"/>
-                <w:szCs w:val="18"/>
-              </w:rPr>
-              <w:t xml:space="preserve">Move from Warehouse</w:t>
-            </w:r>
-          </w:p>
-        </w:tc>
-        <w:tc>
-          <w:tcPr>
-            <w:tcW w:type="dxa" w:w="2200"/>
-            <w:shd w:fill="D9E2F3" w:val="clear"/>
-          </w:tcPr>
-          <w:p>
-            <w:r>
-              <w:rPr>
-                <w:b/>
-                <w:bCs/>
-                <w:sz w:val="18"/>
-                <w:szCs w:val="18"/>
-              </w:rPr>
-              <w:t xml:space="preserve">Move to Warehouse</w:t>
-            </w:r>
-          </w:p>
-        </w:tc>
-        <w:tc>
-          <w:tcPr>
-            <w:tcW w:type="dxa" w:w="2200"/>
-            <w:shd w:fill="D9E2F3" w:val="clear"/>
-          </w:tcPr>
-          <w:p>
-            <w:r>
-              <w:rPr>
-                <w:b/>
-                <w:bCs/>
-                <w:sz w:val="18"/>
-                <w:szCs w:val="18"/>
-              </w:rPr>
-              <w:t xml:space="preserve">Order Value</w:t>
-            </w:r>
-          </w:p>
-        </w:tc>
-      </w:tr>
-      <w:tr>
-        <w:tc>
-          <w:tcPr>
-            <w:tcW w:type="dxa" w:w="2200"/>
-          </w:tcPr>
-          <w:p>
-            <w:r>
-              <w:rPr>
-                <w:sz w:val="18"/>
-                <w:szCs w:val="18"/>
-              </w:rPr>
-              <w:t xml:space="preserve">U108966275</w:t>
-            </w:r>
-          </w:p>
-        </w:tc>
-        <w:tc>
-          <w:tcPr>
-            <w:tcW w:type="dxa" w:w="2200"/>
-          </w:tcPr>
-          <w:p>
-            <w:r>
-              <w:rPr>
-                <w:sz w:val="18"/>
-                <w:szCs w:val="18"/>
-              </w:rPr>
-              <w:t xml:space="preserve">5620</w:t>
-            </w:r>
-          </w:p>
-        </w:tc>
-        <w:tc>
-          <w:tcPr>
-            <w:tcW w:type="dxa" w:w="2200"/>
-          </w:tcPr>
-          <w:p>
-            <w:r>
-              <w:rPr>
-                <w:sz w:val="18"/>
-                <w:szCs w:val="18"/>
-              </w:rPr>
-              <w:t xml:space="preserve">5490</w:t>
-            </w:r>
-          </w:p>
-        </w:tc>
-        <w:tc>
-          <w:tcPr>
-            <w:tcW w:type="dxa" w:w="2200"/>
-          </w:tcPr>
-          <w:p>
-            <w:r>
-              <w:rPr>
-                <w:sz w:val="18"/>
-                <w:szCs w:val="18"/>
-              </w:rPr>
-              <w:t xml:space="preserve">$65,673</w:t>
-            </w:r>
-          </w:p>
-        </w:tc>
-      </w:tr>
-      <w:tr>
-        <w:tc>
-          <w:tcPr>
-            <w:tcW w:type="dxa" w:w="2200"/>
-          </w:tcPr>
-          <w:p>
-            <w:r>
-              <w:rPr>
-                <w:sz w:val="18"/>
-                <w:szCs w:val="18"/>
-              </w:rPr>
-              <w:t xml:space="preserve">U108955078</w:t>
-            </w:r>
-          </w:p>
-        </w:tc>
-        <w:tc>
-          <w:tcPr>
-            <w:tcW w:type="dxa" w:w="2200"/>
-          </w:tcPr>
-          <w:p>
-            <w:r>
-              <w:rPr>
-                <w:sz w:val="18"/>
-                <w:szCs w:val="18"/>
-              </w:rPr>
-              <w:t xml:space="preserve">5410</w:t>
-            </w:r>
-          </w:p>
-        </w:tc>
-        <w:tc>
-          <w:tcPr>
-            <w:tcW w:type="dxa" w:w="2200"/>
-          </w:tcPr>
-          <w:p>
-            <w:r>
-              <w:rPr>
-                <w:sz w:val="18"/>
-                <w:szCs w:val="18"/>
-              </w:rPr>
-              <w:t xml:space="preserve">5490</w:t>
-            </w:r>
-          </w:p>
-        </w:tc>
-        <w:tc>
-          <w:tcPr>
-            <w:tcW w:type="dxa" w:w="2200"/>
-          </w:tcPr>
-          <w:p>
-            <w:r>
-              <w:rPr>
-                <w:sz w:val="18"/>
-                <w:szCs w:val="18"/>
-              </w:rPr>
-              <w:t xml:space="preserve">$21,310</w:t>
-            </w:r>
-          </w:p>
-        </w:tc>
-      </w:tr>
-      <w:tr>
-        <w:tc>
-          <w:tcPr>
-            <w:tcW w:type="dxa" w:w="2200"/>
-          </w:tcPr>
-          <w:p>
-            <w:r>
-              <w:rPr>
-                <w:sz w:val="18"/>
-                <w:szCs w:val="18"/>
-              </w:rPr>
-              <w:t xml:space="preserve">U108963192</w:t>
-            </w:r>
-          </w:p>
-        </w:tc>
-        <w:tc>
-          <w:tcPr>
-            <w:tcW w:type="dxa" w:w="2200"/>
-          </w:tcPr>
-          <w:p>
-            <w:r>
-              <w:rPr>
-                <w:sz w:val="18"/>
-                <w:szCs w:val="18"/>
-              </w:rPr>
-              <w:t xml:space="preserve">5620</w:t>
-            </w:r>
-          </w:p>
-        </w:tc>
-        <w:tc>
-          <w:tcPr>
-            <w:tcW w:type="dxa" w:w="2200"/>
-          </w:tcPr>
-          <w:p>
-            <w:r>
-              <w:rPr>
-                <w:sz w:val="18"/>
-                <w:szCs w:val="18"/>
-              </w:rPr>
-              <w:t xml:space="preserve">5420</w:t>
-            </w:r>
-          </w:p>
-        </w:tc>
-        <w:tc>
-          <w:tcPr>
-            <w:tcW w:type="dxa" w:w="2200"/>
-          </w:tcPr>
-          <w:p>
-            <w:r>
-              <w:rPr>
-                <w:sz w:val="18"/>
-                <w:szCs w:val="18"/>
-              </w:rPr>
-              <w:t xml:space="preserve">$18,724</w:t>
-            </w:r>
-          </w:p>
-        </w:tc>
-      </w:tr>
-      <w:tr>
-        <w:tc>
-          <w:tcPr>
-            <w:tcW w:type="dxa" w:w="2200"/>
-          </w:tcPr>
-          <w:p>
-            <w:r>
-              <w:rPr>
-                <w:sz w:val="18"/>
-                <w:szCs w:val="18"/>
-              </w:rPr>
-              <w:t xml:space="preserve">U108971149</w:t>
-            </w:r>
-          </w:p>
-        </w:tc>
-        <w:tc>
-          <w:tcPr>
-            <w:tcW w:type="dxa" w:w="2200"/>
-          </w:tcPr>
-          <w:p>
-            <w:r>
-              <w:rPr>
-                <w:sz w:val="18"/>
-                <w:szCs w:val="18"/>
-              </w:rPr>
-              <w:t xml:space="preserve">5420</w:t>
-            </w:r>
-          </w:p>
-        </w:tc>
-        <w:tc>
-          <w:tcPr>
-            <w:tcW w:type="dxa" w:w="2200"/>
-          </w:tcPr>
-          <w:p>
-            <w:r>
-              <w:rPr>
-                <w:sz w:val="18"/>
-                <w:szCs w:val="18"/>
-              </w:rPr>
-              <w:t xml:space="preserve">5641</w:t>
-            </w:r>
-          </w:p>
-        </w:tc>
-        <w:tc>
-          <w:tcPr>
-            <w:tcW w:type="dxa" w:w="2200"/>
-          </w:tcPr>
-          <w:p>
-            <w:r>
-              <w:rPr>
-                <w:sz w:val="18"/>
-                <w:szCs w:val="18"/>
-              </w:rPr>
-              <w:t xml:space="preserve">$16,985</w:t>
-            </w:r>
-          </w:p>
-        </w:tc>
-      </w:tr>
-      <w:tr>
-        <w:tc>
-          <w:tcPr>
-            <w:tcW w:type="dxa" w:w="2200"/>
-          </w:tcPr>
-          <w:p>
-            <w:r>
-              <w:rPr>
-                <w:sz w:val="18"/>
-                <w:szCs w:val="18"/>
-              </w:rPr>
-              <w:t xml:space="preserve">U108948387</w:t>
-            </w:r>
-          </w:p>
-        </w:tc>
-        <w:tc>
-          <w:tcPr>
-            <w:tcW w:type="dxa" w:w="2200"/>
-          </w:tcPr>
-          <w:p>
-            <w:r>
-              <w:rPr>
-                <w:sz w:val="18"/>
-                <w:szCs w:val="18"/>
-              </w:rPr>
-              <w:t xml:space="preserve">5410</w:t>
-            </w:r>
-          </w:p>
-        </w:tc>
-        <w:tc>
-          <w:tcPr>
-            <w:tcW w:type="dxa" w:w="2200"/>
-          </w:tcPr>
-          <w:p>
-            <w:r>
-              <w:rPr>
-                <w:sz w:val="18"/>
-                <w:szCs w:val="18"/>
-              </w:rPr>
-              <w:t xml:space="preserve">5385</w:t>
-            </w:r>
-          </w:p>
-        </w:tc>
-        <w:tc>
-          <w:tcPr>
-            <w:tcW w:type="dxa" w:w="2200"/>
-          </w:tcPr>
-          <w:p>
-            <w:r>
-              <w:rPr>
-                <w:sz w:val="18"/>
-                <w:szCs w:val="18"/>
-              </w:rPr>
-              <w:t xml:space="preserve">$10,721</w:t>
-            </w:r>
-          </w:p>
-        </w:tc>
-      </w:tr>
-    </w:tbl>
+        <w:t xml:space="preserve">The pattern behind the recommended moves</w:t>
+      </w:r>
+    </w:p>
     <w:p>
       <w:pPr>
         <w:spacing w:after="100"/>
       </w:pPr>
       <w:r>
-        <w:t xml:space="preserve"> </w:t>
-      </w:r>
-    </w:p>
-    <w:p>
-      <w:pPr>
-        <w:spacing w:after="100"/>
-      </w:pPr>
-      <w:r>
-        <w:t xml:space="preserve">These are the highest-value moves recommended — each one is a case where a nearby warehouse has stock the assigned one doesn't, and the extra delivery cost is worth paying to capture the order.</w:t>
+        <w:t xml:space="preserve">The highest-value recommended moves share a common shape: a nearby warehouse has stock the assigned one doesn't, and the order is valuable enough that the extra delivery cost is clearly worth paying to capture it. The single largest recommended move alone accounts for roughly $65,000 in order value; the top five moves combined account for well over $130,000. (Order-level identifiers, specific warehouse codes, and exact figures are omitted from this business-facing summary and from any public copy of this document — full detail is available in the technical report and code repository, restricted to the authorized challenge environment per WISER/Nestlé data-handling rules.)</w:t>
       </w:r>
     </w:p>
     <w:p>
@@ -724,18 +337,6 @@
       <w:lvlJc w:val="left"/>
       <w:pPr>
         <w:ind w:left="6480" w:hanging="360"/>
-      </w:pPr>
-    </w:lvl>
-  </w:abstractNum>
-  <w:abstractNum w:abstractNumId="2" w15:restartNumberingAfterBreak="0">
-    <w:multiLevelType w:val="hybridMultilevel"/>
-    <w:lvl w:ilvl="0" w15:tentative="1">
-      <w:start w:val="1"/>
-      <w:numFmt w:val="bullet"/>
-      <w:lvlText w:val="•"/>
-      <w:lvlJc w:val="left"/>
-      <w:pPr>
-        <w:ind w:left="360" w:hanging="260"/>
       </w:pPr>
     </w:lvl>
   </w:abstractNum>

</xml_diff>